<commit_message>
Add environments plan (Dev/UAT/Prod) + data-residency & environments diagrams
- ENVIRONMENTS-PLAN.md (+ .docx): Dev environment design & cost, MVP->UAT
  conversion checklist, promotion flow, three-environment cost summary
- diagrams/04-data-residency-boundary.svg: SOC 2 trust-boundary / network view
- diagrams/05-environments-topology.svg: Dev -> UAT -> Prod promotion topology
- MobiCova-Health-Production-Plan.docx: rebuilt with the data-residency diagram added

Co-Authored-By: Claude Opus 4.8 (1M context) <noreply@anthropic.com>
</commit_message>
<xml_diff>
--- a/MobiCova-Health-Production-Plan.docx
+++ b/MobiCova-Health-Production-Plan.docx
@@ -3712,6 +3712,226 @@
     </w:p>
     <w:bookmarkEnd w:id="23"/>
     <w:bookmarkEnd w:id="24"/>
+    <w:p>
+      <w:r>
+        <w:br w:type="page"/>
+      </w:r>
+    </w:p>
+    <w:p>
+      <w:r>
+        <w:rPr>
+          <w:rFonts w:ascii="Calibri" w:hAnsi="Calibri"/>
+          <w:b/>
+          <w:color w:val="0A7B7B"/>
+          <w:sz w:val="36"/>
+        </w:rPr>
+        <w:t>Architecture diagrams</w:t>
+      </w:r>
+    </w:p>
+    <w:p>
+      <w:r>
+        <w:rPr>
+          <w:rFonts w:ascii="Calibri" w:hAnsi="Calibri"/>
+          <w:b/>
+          <w:color w:val="0A7B7B"/>
+          <w:sz w:val="23"/>
+        </w:rPr>
+        <w:t>Target production architecture (Tier B, AWS af-south-1)</w:t>
+      </w:r>
+    </w:p>
+    <w:p>
+      <w:pPr>
+        <w:jc w:val="center"/>
+      </w:pPr>
+      <w:r>
+        <w:drawing>
+          <wp:inline>
+            <wp:extent cx="5852160" cy="3513167"/>
+            <wp:docPr id="2" name="Picture 2"/>
+            <wp:cNvGraphicFramePr>
+              <a:graphicFrameLocks noChangeAspect="1"/>
+            </wp:cNvGraphicFramePr>
+            <a:graphic>
+              <a:graphicData uri="http://schemas.openxmlformats.org/drawingml/2006/picture">
+                <pic:pic>
+                  <pic:nvPicPr>
+                    <pic:cNvPr id="0" name="01-target-architecture.png"/>
+                    <pic:cNvPicPr/>
+                  </pic:nvPicPr>
+                  <pic:blipFill>
+                    <a:blip r:embed="rId10"/>
+                    <a:stretch>
+                      <a:fillRect/>
+                    </a:stretch>
+                  </pic:blipFill>
+                  <pic:spPr>
+                    <a:xfrm>
+                      <a:off x="0" y="0"/>
+                      <a:ext cx="5852160" cy="3513167"/>
+                    </a:xfrm>
+                    <a:prstGeom prst="rect"/>
+                  </pic:spPr>
+                </pic:pic>
+              </a:graphicData>
+            </a:graphic>
+          </wp:inline>
+        </w:drawing>
+      </w:r>
+    </w:p>
+    <w:p/>
+    <w:p>
+      <w:r>
+        <w:rPr>
+          <w:rFonts w:ascii="Calibri" w:hAnsi="Calibri"/>
+          <w:b/>
+          <w:color w:val="0A7B7B"/>
+          <w:sz w:val="23"/>
+        </w:rPr>
+        <w:t>Fault tolerance &amp; failover (multi-AZ)</w:t>
+      </w:r>
+    </w:p>
+    <w:p>
+      <w:pPr>
+        <w:jc w:val="center"/>
+      </w:pPr>
+      <w:r>
+        <w:drawing>
+          <wp:inline>
+            <wp:extent cx="5669280" cy="3403582"/>
+            <wp:docPr id="3" name="Picture 3"/>
+            <wp:cNvGraphicFramePr>
+              <a:graphicFrameLocks noChangeAspect="1"/>
+            </wp:cNvGraphicFramePr>
+            <a:graphic>
+              <a:graphicData uri="http://schemas.openxmlformats.org/drawingml/2006/picture">
+                <pic:pic>
+                  <pic:nvPicPr>
+                    <pic:cNvPr id="0" name="02-fault-tolerance.png"/>
+                    <pic:cNvPicPr/>
+                  </pic:nvPicPr>
+                  <pic:blipFill>
+                    <a:blip r:embed="rId11"/>
+                    <a:stretch>
+                      <a:fillRect/>
+                    </a:stretch>
+                  </pic:blipFill>
+                  <pic:spPr>
+                    <a:xfrm>
+                      <a:off x="0" y="0"/>
+                      <a:ext cx="5669280" cy="3403582"/>
+                    </a:xfrm>
+                    <a:prstGeom prst="rect"/>
+                  </pic:spPr>
+                </pic:pic>
+              </a:graphicData>
+            </a:graphic>
+          </wp:inline>
+        </w:drawing>
+      </w:r>
+    </w:p>
+    <w:p/>
+    <w:p>
+      <w:r>
+        <w:rPr>
+          <w:rFonts w:ascii="Calibri" w:hAnsi="Calibri"/>
+          <w:b/>
+          <w:color w:val="0A7B7B"/>
+          <w:sz w:val="23"/>
+        </w:rPr>
+        <w:t>Data residency &amp; network boundary (SOC 2)</w:t>
+      </w:r>
+    </w:p>
+    <w:p>
+      <w:pPr>
+        <w:jc w:val="center"/>
+      </w:pPr>
+      <w:r>
+        <w:drawing>
+          <wp:inline>
+            <wp:extent cx="5852160" cy="3818395"/>
+            <wp:docPr id="4" name="Picture 4"/>
+            <wp:cNvGraphicFramePr>
+              <a:graphicFrameLocks noChangeAspect="1"/>
+            </wp:cNvGraphicFramePr>
+            <a:graphic>
+              <a:graphicData uri="http://schemas.openxmlformats.org/drawingml/2006/picture">
+                <pic:pic>
+                  <pic:nvPicPr>
+                    <pic:cNvPr id="0" name="04-data-residency-boundary.png"/>
+                    <pic:cNvPicPr/>
+                  </pic:nvPicPr>
+                  <pic:blipFill>
+                    <a:blip r:embed="rId12"/>
+                    <a:stretch>
+                      <a:fillRect/>
+                    </a:stretch>
+                  </pic:blipFill>
+                  <pic:spPr>
+                    <a:xfrm>
+                      <a:off x="0" y="0"/>
+                      <a:ext cx="5852160" cy="3818395"/>
+                    </a:xfrm>
+                    <a:prstGeom prst="rect"/>
+                  </pic:spPr>
+                </pic:pic>
+              </a:graphicData>
+            </a:graphic>
+          </wp:inline>
+        </w:drawing>
+      </w:r>
+    </w:p>
+    <w:p/>
+    <w:p>
+      <w:r>
+        <w:rPr>
+          <w:rFonts w:ascii="Calibri" w:hAnsi="Calibri"/>
+          <w:b/>
+          <w:color w:val="0A7B7B"/>
+          <w:sz w:val="23"/>
+        </w:rPr>
+        <w:t>Phased roadmap</w:t>
+      </w:r>
+    </w:p>
+    <w:p>
+      <w:pPr>
+        <w:jc w:val="center"/>
+      </w:pPr>
+      <w:r>
+        <w:drawing>
+          <wp:inline>
+            <wp:extent cx="5852160" cy="1794790"/>
+            <wp:docPr id="5" name="Picture 5"/>
+            <wp:cNvGraphicFramePr>
+              <a:graphicFrameLocks noChangeAspect="1"/>
+            </wp:cNvGraphicFramePr>
+            <a:graphic>
+              <a:graphicData uri="http://schemas.openxmlformats.org/drawingml/2006/picture">
+                <pic:pic>
+                  <pic:nvPicPr>
+                    <pic:cNvPr id="0" name="03-phased-roadmap.png"/>
+                    <pic:cNvPicPr/>
+                  </pic:nvPicPr>
+                  <pic:blipFill>
+                    <a:blip r:embed="rId13"/>
+                    <a:stretch>
+                      <a:fillRect/>
+                    </a:stretch>
+                  </pic:blipFill>
+                  <pic:spPr>
+                    <a:xfrm>
+                      <a:off x="0" y="0"/>
+                      <a:ext cx="5852160" cy="1794790"/>
+                    </a:xfrm>
+                    <a:prstGeom prst="rect"/>
+                  </pic:spPr>
+                </pic:pic>
+              </a:graphicData>
+            </a:graphic>
+          </wp:inline>
+        </w:drawing>
+      </w:r>
+    </w:p>
+    <w:p/>
     <w:sectPr>
       <w:footnotePr>
         <w:numRestart w:val="eachSect"/>

</xml_diff>